<commit_message>
Finish AI template 2, 3, 5, 6
</commit_message>
<xml_diff>
--- a/AI_Templates/[AI-02] - FIT@HCMUS - AI Audit Report_En.docx
+++ b/AI_Templates/[AI-02] - FIT@HCMUS - AI Audit Report_En.docx
@@ -336,7 +336,13 @@
               <w:rPr>
                 <w:rFonts w:ascii="Arial" w:hAnsi="Arial" w:cs="Arial"/>
               </w:rPr>
-              <w:t>23KTPM2</w:t>
+              <w:t>23KTPM</w:t>
+            </w:r>
+            <w:r>
+              <w:rPr>
+                <w:rFonts w:ascii="Arial" w:hAnsi="Arial" w:cs="Arial"/>
+              </w:rPr>
+              <w:t>3</w:t>
             </w:r>
           </w:p>
         </w:tc>
@@ -22468,6 +22474,7 @@
   <w:style w:type="character" w:default="1" w:styleId="DefaultParagraphFont">
     <w:name w:val="Default Paragraph Font"/>
     <w:uiPriority w:val="1"/>
+    <w:semiHidden/>
     <w:unhideWhenUsed/>
   </w:style>
   <w:style w:type="table" w:default="1" w:styleId="TableNormal">

</xml_diff>